<commit_message>
reports migration from word to typst
</commit_message>
<xml_diff>
--- a/docs/reports/Пояснительная записка АВС гексапод.docx
+++ b/docs/reports/Пояснительная записка АВС гексапод.docx
@@ -880,10 +880,38 @@
           <w:rFonts w:eastAsia="Calibri"/>
           <w:sz w:val="28"/>
           <w:szCs w:val="28"/>
-        </w:rPr>
-      </w:pPr>
-    </w:p>
-    <w:bookmarkStart w:id="0" w:name="_Hlk200103456"/>
+          <w:lang w:val="en-US"/>
+        </w:rPr>
+      </w:pPr>
+    </w:p>
+    <w:p>
+      <w:pPr>
+        <w:widowControl/>
+        <w:suppressAutoHyphens/>
+        <w:autoSpaceDE/>
+        <w:autoSpaceDN/>
+        <w:rPr>
+          <w:rFonts w:eastAsia="Calibri"/>
+          <w:sz w:val="28"/>
+          <w:szCs w:val="28"/>
+          <w:lang w:val="en-US"/>
+        </w:rPr>
+      </w:pPr>
+    </w:p>
+    <w:p>
+      <w:pPr>
+        <w:widowControl/>
+        <w:suppressAutoHyphens/>
+        <w:autoSpaceDE/>
+        <w:autoSpaceDN/>
+        <w:rPr>
+          <w:rFonts w:eastAsia="Calibri"/>
+          <w:sz w:val="28"/>
+          <w:szCs w:val="28"/>
+          <w:lang w:val="en-US"/>
+        </w:rPr>
+      </w:pPr>
+    </w:p>
     <w:p>
       <w:pPr>
         <w:jc w:val="center"/>
@@ -892,71 +920,7 @@
           <w:szCs w:val="28"/>
         </w:rPr>
       </w:pPr>
-      <w:r>
-        <w:rPr>
-          <w:rFonts w:ascii="Calibri" w:eastAsia="Calibri" w:hAnsi="Calibri" w:cs="Calibri"/>
-          <w:noProof/>
-        </w:rPr>
-        <mc:AlternateContent>
-          <mc:Choice Requires="wps">
-            <w:drawing>
-              <wp:anchor distT="6985" distB="5715" distL="6985" distR="5715" simplePos="0" relativeHeight="487593472" behindDoc="0" locked="0" layoutInCell="1" allowOverlap="1" wp14:anchorId="68A91B38" wp14:editId="0CDE5A89">
-                <wp:simplePos x="0" y="0"/>
-                <wp:positionH relativeFrom="column">
-                  <wp:posOffset>5702300</wp:posOffset>
-                </wp:positionH>
-                <wp:positionV relativeFrom="paragraph">
-                  <wp:posOffset>127318</wp:posOffset>
-                </wp:positionV>
-                <wp:extent cx="597535" cy="1020445"/>
-                <wp:effectExtent l="0" t="0" r="12065" b="27305"/>
-                <wp:wrapNone/>
-                <wp:docPr id="1317566060" name="Прямоугольник 8"/>
-                <wp:cNvGraphicFramePr/>
-                <a:graphic xmlns:a="http://schemas.openxmlformats.org/drawingml/2006/main">
-                  <a:graphicData uri="http://schemas.microsoft.com/office/word/2010/wordprocessingShape">
-                    <wps:wsp>
-                      <wps:cNvSpPr/>
-                      <wps:spPr>
-                        <a:xfrm>
-                          <a:off x="0" y="0"/>
-                          <a:ext cx="597535" cy="1020445"/>
-                        </a:xfrm>
-                        <a:prstGeom prst="rect">
-                          <a:avLst/>
-                        </a:prstGeom>
-                        <a:solidFill>
-                          <a:srgbClr val="FFFFFF"/>
-                        </a:solidFill>
-                        <a:ln w="12700" cap="flat" cmpd="sng" algn="ctr">
-                          <a:solidFill>
-                            <a:srgbClr val="FFFFFF"/>
-                          </a:solidFill>
-                          <a:prstDash val="solid"/>
-                          <a:miter lim="800000"/>
-                        </a:ln>
-                        <a:effectLst/>
-                      </wps:spPr>
-                      <wps:bodyPr vertOverflow="clip" horzOverflow="clip"/>
-                    </wps:wsp>
-                  </a:graphicData>
-                </a:graphic>
-                <wp14:sizeRelH relativeFrom="page">
-                  <wp14:pctWidth>0</wp14:pctWidth>
-                </wp14:sizeRelH>
-                <wp14:sizeRelV relativeFrom="page">
-                  <wp14:pctHeight>0</wp14:pctHeight>
-                </wp14:sizeRelV>
-              </wp:anchor>
-            </w:drawing>
-          </mc:Choice>
-          <mc:Fallback>
-            <w:pict>
-              <v:rect w14:anchorId="663600B1" id="Прямоугольник 8" o:spid="_x0000_s1026" style="position:absolute;margin-left:449pt;margin-top:10.05pt;width:47.05pt;height:80.35pt;z-index:487593472;visibility:visible;mso-wrap-style:square;mso-width-percent:0;mso-height-percent:0;mso-wrap-distance-left:.55pt;mso-wrap-distance-top:.55pt;mso-wrap-distance-right:.45pt;mso-wrap-distance-bottom:.45pt;mso-position-horizontal:absolute;mso-position-horizontal-relative:text;mso-position-vertical:absolute;mso-position-vertical-relative:text;mso-width-percent:0;mso-height-percent:0;mso-width-relative:page;mso-height-relative:page;v-text-anchor:top" o:gfxdata="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" strokecolor="white" strokeweight="1pt"/>
-            </w:pict>
-          </mc:Fallback>
-        </mc:AlternateContent>
-      </w:r>
+      <w:bookmarkStart w:id="0" w:name="_Hlk200103456"/>
       <w:r>
         <w:rPr>
           <w:rFonts w:eastAsia="Calibri"/>
@@ -976,80 +940,6 @@
       </w:r>
       <w:r>
         <w:br w:type="page"/>
-      </w:r>
-      <w:r>
-        <w:rPr>
-          <w:b/>
-          <w:noProof/>
-          <w:spacing w:val="-2"/>
-          <w:sz w:val="32"/>
-        </w:rPr>
-        <mc:AlternateContent>
-          <mc:Choice Requires="wps">
-            <w:drawing>
-              <wp:anchor distT="0" distB="0" distL="114300" distR="114300" simplePos="0" relativeHeight="487594496" behindDoc="0" locked="0" layoutInCell="1" allowOverlap="1" wp14:anchorId="231162C8" wp14:editId="43B2C342">
-                <wp:simplePos x="0" y="0"/>
-                <wp:positionH relativeFrom="column">
-                  <wp:posOffset>5335588</wp:posOffset>
-                </wp:positionH>
-                <wp:positionV relativeFrom="paragraph">
-                  <wp:posOffset>768985</wp:posOffset>
-                </wp:positionV>
-                <wp:extent cx="962025" cy="647700"/>
-                <wp:effectExtent l="0" t="0" r="28575" b="19050"/>
-                <wp:wrapNone/>
-                <wp:docPr id="692266095" name="Прямоугольник 5"/>
-                <wp:cNvGraphicFramePr/>
-                <a:graphic xmlns:a="http://schemas.openxmlformats.org/drawingml/2006/main">
-                  <a:graphicData uri="http://schemas.microsoft.com/office/word/2010/wordprocessingShape">
-                    <wps:wsp>
-                      <wps:cNvSpPr/>
-                      <wps:spPr>
-                        <a:xfrm>
-                          <a:off x="0" y="0"/>
-                          <a:ext cx="962025" cy="647700"/>
-                        </a:xfrm>
-                        <a:prstGeom prst="rect">
-                          <a:avLst/>
-                        </a:prstGeom>
-                        <a:ln>
-                          <a:solidFill>
-                            <a:schemeClr val="bg1"/>
-                          </a:solidFill>
-                        </a:ln>
-                      </wps:spPr>
-                      <wps:style>
-                        <a:lnRef idx="2">
-                          <a:schemeClr val="accent1"/>
-                        </a:lnRef>
-                        <a:fillRef idx="1">
-                          <a:schemeClr val="lt1"/>
-                        </a:fillRef>
-                        <a:effectRef idx="0">
-                          <a:schemeClr val="accent1"/>
-                        </a:effectRef>
-                        <a:fontRef idx="minor">
-                          <a:schemeClr val="dk1"/>
-                        </a:fontRef>
-                      </wps:style>
-                      <wps:bodyPr rot="0" spcFirstLastPara="0" vertOverflow="overflow" horzOverflow="overflow" vert="horz" wrap="square" lIns="91440" tIns="45720" rIns="91440" bIns="45720" numCol="1" spcCol="0" rtlCol="0" fromWordArt="0" anchor="ctr" anchorCtr="0" forceAA="0" compatLnSpc="1">
-                        <a:prstTxWarp prst="textNoShape">
-                          <a:avLst/>
-                        </a:prstTxWarp>
-                        <a:noAutofit/>
-                      </wps:bodyPr>
-                    </wps:wsp>
-                  </a:graphicData>
-                </a:graphic>
-              </wp:anchor>
-            </w:drawing>
-          </mc:Choice>
-          <mc:Fallback>
-            <w:pict>
-              <v:rect w14:anchorId="07836B6D" id="Прямоугольник 5" o:spid="_x0000_s1026" style="position:absolute;margin-left:420.15pt;margin-top:60.55pt;width:75.75pt;height:51pt;z-index:487594496;visibility:visible;mso-wrap-style:square;mso-wrap-distance-left:9pt;mso-wrap-distance-top:0;mso-wrap-distance-right:9pt;mso-wrap-distance-bottom:0;mso-position-horizontal:absolute;mso-position-horizontal-relative:text;mso-position-vertical:absolute;mso-position-vertical-relative:text;v-text-anchor:middle" o:gfxdata="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" fillcolor="white [3201]" strokecolor="white [3212]" strokeweight="2pt"/>
-            </w:pict>
-          </mc:Fallback>
-        </mc:AlternateContent>
       </w:r>
     </w:p>
     <w:p>
@@ -2216,6 +2106,7 @@
           <w:pgMar w:top="1134" w:right="851" w:bottom="1134" w:left="1701" w:header="0" w:footer="567" w:gutter="0"/>
           <w:pgNumType w:start="3"/>
           <w:cols w:space="720"/>
+          <w:titlePg/>
           <w:docGrid w:linePitch="299"/>
         </w:sectPr>
       </w:pPr>
@@ -2256,7 +2147,15 @@
         <w:spacing w:line="242" w:lineRule="auto"/>
       </w:pPr>
       <w:r>
-        <w:t>В современной робототехнике шагающие многоосевые платформы</w:t>
+        <w:t xml:space="preserve">В современной робототехнике шагающие </w:t>
+      </w:r>
+      <w:proofErr w:type="spellStart"/>
+      <w:r>
+        <w:t>многоосевые</w:t>
+      </w:r>
+      <w:proofErr w:type="spellEnd"/>
+      <w:r>
+        <w:t xml:space="preserve"> платформы</w:t>
       </w:r>
       <w:r>
         <w:t xml:space="preserve"> </w:t>
@@ -2325,7 +2224,23 @@
         <w:spacing w:line="242" w:lineRule="auto"/>
       </w:pPr>
       <w:r>
-        <w:t>Программная реализация проекта строится на использовании операционной системы реального времени FreeRTOS в официальной среде разработки ESP-IDF. Это позволяет строго и безопасно разнести асинхронные сетевые процессы и ресурсоемкие математические вычисления инверсной кинематики по разным ядрам чипа. Завершающим этапом проектирования комплекса выступает разработка одностраничного веб-приложения на базе фреймворка Vue.js. Данный интерфейс, сохраняемый непосредственно в файловой системе микроконтроллера, обеспечивает визуализацию телеметрии и двунаправленную передачу управляющих команд по протоколу WebSocket с минимальными задержками на любом пользовательском устройстве.</w:t>
+        <w:t xml:space="preserve">Программная реализация проекта строится на использовании операционной системы реального времени </w:t>
+      </w:r>
+      <w:proofErr w:type="spellStart"/>
+      <w:r>
+        <w:t>FreeRTOS</w:t>
+      </w:r>
+      <w:proofErr w:type="spellEnd"/>
+      <w:r>
+        <w:t xml:space="preserve"> в официальной среде разработки ESP-IDF. Это позволяет строго и безопасно разнести асинхронные сетевые процессы и ресурсоемкие математические вычисления инверсной кинематики по разным ядрам чипа. Завершающим этапом проектирования комплекса выступает разработка одностраничного веб-приложения на базе фреймворка Vue.js. Данный интерфейс, сохраняемый непосредственно в файловой системе микроконтроллера, обеспечивает визуализацию телеметрии и двунаправленную передачу управляющих команд по протоколу </w:t>
+      </w:r>
+      <w:proofErr w:type="spellStart"/>
+      <w:r>
+        <w:t>WebSocket</w:t>
+      </w:r>
+      <w:proofErr w:type="spellEnd"/>
+      <w:r>
+        <w:t xml:space="preserve"> с минимальными задержками на любом пользовательском устройстве.</w:t>
       </w:r>
     </w:p>
     <w:p>
@@ -2510,7 +2425,39 @@
           <w:sz w:val="28"/>
           <w:szCs w:val="28"/>
         </w:rPr>
-        <w:t>Микроконтроллеры серии ESP32 разработаны компанией Espressif Systems как эволюционное развитие чипа ESP8266. Главными достоинствами актуальной версии являются встроенные модули Wi-Fi и Bluetooth, высокая тактовая частота, наличие независимого сопроцессора с низким энергопотреблением и аппаратная поддержка широкого спектра интерфейсо</w:t>
+        <w:t xml:space="preserve">Микроконтроллеры серии ESP32 разработаны компанией </w:t>
+      </w:r>
+      <w:proofErr w:type="spellStart"/>
+      <w:r>
+        <w:rPr>
+          <w:sz w:val="28"/>
+          <w:szCs w:val="28"/>
+        </w:rPr>
+        <w:t>Espressif</w:t>
+      </w:r>
+      <w:proofErr w:type="spellEnd"/>
+      <w:r>
+        <w:rPr>
+          <w:sz w:val="28"/>
+          <w:szCs w:val="28"/>
+        </w:rPr>
+        <w:t xml:space="preserve"> Systems как эволюционное развитие чипа ESP8266. Главными достоинствами актуальной версии являются встроенные модули </w:t>
+      </w:r>
+      <w:proofErr w:type="spellStart"/>
+      <w:r>
+        <w:rPr>
+          <w:sz w:val="28"/>
+          <w:szCs w:val="28"/>
+        </w:rPr>
+        <w:t>Wi</w:t>
+      </w:r>
+      <w:proofErr w:type="spellEnd"/>
+      <w:r>
+        <w:rPr>
+          <w:sz w:val="28"/>
+          <w:szCs w:val="28"/>
+        </w:rPr>
+        <w:t>-Fi и Bluetooth, высокая тактовая частота, наличие независимого сопроцессора с низким энергопотреблением и аппаратная поддержка широкого спектра интерфейсо</w:t>
       </w:r>
       <w:r>
         <w:rPr>
@@ -2853,7 +2800,23 @@
           <w:sz w:val="28"/>
           <w:szCs w:val="28"/>
         </w:rPr>
-        <w:t xml:space="preserve">Для решения этой проблемы в архитектуру внедрены два шестнадцатиканальных контроллера </w:t>
+        <w:t xml:space="preserve">Для решения этой проблемы в архитектуру внедрены два </w:t>
+      </w:r>
+      <w:proofErr w:type="spellStart"/>
+      <w:r>
+        <w:rPr>
+          <w:sz w:val="28"/>
+          <w:szCs w:val="28"/>
+        </w:rPr>
+        <w:t>шестнадцатиканальных</w:t>
+      </w:r>
+      <w:proofErr w:type="spellEnd"/>
+      <w:r>
+        <w:rPr>
+          <w:sz w:val="28"/>
+          <w:szCs w:val="28"/>
+        </w:rPr>
+        <w:t xml:space="preserve"> контроллера </w:t>
       </w:r>
       <w:r>
         <w:rPr>
@@ -3089,7 +3052,23 @@
           <w:sz w:val="28"/>
           <w:szCs w:val="28"/>
         </w:rPr>
-        <w:t xml:space="preserve"> аппаратно изолирована от логической части микроконтроллера, сохраняя с ней лишь общую линию заземления. В качестве первичного источника энергии используется сборка из двух литий-ионных аккумуляторов, размещенных в специальном батарейном отсеке. Такая архитектура исключает влияние электромагнитных помех и просадок напряжения от моторов на стабильность работы процессора.</w:t>
+        <w:t xml:space="preserve"> </w:t>
+      </w:r>
+      <w:proofErr w:type="spellStart"/>
+      <w:r>
+        <w:rPr>
+          <w:sz w:val="28"/>
+          <w:szCs w:val="28"/>
+        </w:rPr>
+        <w:t>аппаратно</w:t>
+      </w:r>
+      <w:proofErr w:type="spellEnd"/>
+      <w:r>
+        <w:rPr>
+          <w:sz w:val="28"/>
+          <w:szCs w:val="28"/>
+        </w:rPr>
+        <w:t xml:space="preserve"> изолирована от логической части микроконтроллера, сохраняя с ней лишь общую линию заземления. В качестве первичного источника энергии используется сборка из двух литий-ионных аккумуляторов, размещенных в специальном батарейном отсеке. Такая архитектура исключает влияние электромагнитных помех и просадок напряжения от моторов на стабильность работы процессора.</w:t>
       </w:r>
     </w:p>
     <w:p>
@@ -3253,7 +3232,6 @@
           <w:bCs/>
           <w:sz w:val="28"/>
           <w:szCs w:val="28"/>
-          <w:lang w:val="en-US"/>
         </w:rPr>
       </w:pPr>
     </w:p>
@@ -3289,7 +3267,23 @@
           <w:sz w:val="28"/>
           <w:szCs w:val="28"/>
         </w:rPr>
-        <w:t>Поскольку робот функционирует автономно и не имеет встроенного дисплея, для взаимодействия с оператором и оперативной диагностики предусмотрена система акустического и визуального оповещения. Звуковые сигналы генерируются с помощью пассивного пьезоизлучателя KY-006. Благодаря возможности программного управления частотой, излучатель способен воспроизводить различные звуковые тональности, четко сигнализируя об успешном запуске системы, потере сетевого соединения или критическом разряде аккумулятора.</w:t>
+        <w:t xml:space="preserve">Поскольку робот функционирует автономно и не имеет встроенного дисплея, для взаимодействия с оператором и оперативной диагностики предусмотрена система акустического и визуального оповещения. Звуковые сигналы генерируются с помощью пассивного </w:t>
+      </w:r>
+      <w:proofErr w:type="spellStart"/>
+      <w:r>
+        <w:rPr>
+          <w:sz w:val="28"/>
+          <w:szCs w:val="28"/>
+        </w:rPr>
+        <w:t>пьезоизлучателя</w:t>
+      </w:r>
+      <w:proofErr w:type="spellEnd"/>
+      <w:r>
+        <w:rPr>
+          <w:sz w:val="28"/>
+          <w:szCs w:val="28"/>
+        </w:rPr>
+        <w:t xml:space="preserve"> KY-006. Благодаря возможности программного управления частотой, излучатель способен воспроизводить различные звуковые тональности, четко сигнализируя об успешном запуске системы, потере сетевого соединения или критическом разряде аккумулятора.</w:t>
       </w:r>
     </w:p>
     <w:p>
@@ -3364,12 +3358,21 @@
           <w:szCs w:val="28"/>
         </w:rPr>
       </w:pPr>
-      <w:r>
-        <w:rPr>
-          <w:sz w:val="28"/>
-          <w:szCs w:val="28"/>
-        </w:rPr>
-        <w:t>Espressif Systems является пионером в разработке платформ полного цикла, обеспечивающих работу интеллектуальных, энергоэффективных устройств Интернета вещей и периферийного ИИ</w:t>
+      <w:proofErr w:type="spellStart"/>
+      <w:r>
+        <w:rPr>
+          <w:sz w:val="28"/>
+          <w:szCs w:val="28"/>
+        </w:rPr>
+        <w:t>Espressif</w:t>
+      </w:r>
+      <w:proofErr w:type="spellEnd"/>
+      <w:r>
+        <w:rPr>
+          <w:sz w:val="28"/>
+          <w:szCs w:val="28"/>
+        </w:rPr>
+        <w:t xml:space="preserve"> Systems является пионером в разработке платформ полного цикла, обеспечивающих работу интеллектуальных, энергоэффективных устройств Интернета вещей и периферийного ИИ</w:t>
       </w:r>
       <w:r>
         <w:rPr>
@@ -3425,7 +3428,23 @@
           <w:sz w:val="28"/>
           <w:szCs w:val="28"/>
         </w:rPr>
-        <w:t>. Прорывное сочетание вычислительных мощностей и сетевых возможностей в наших системах-на-кристалле изменило ландшафт IoT, сделав массовые умные устройства доступными для всех.</w:t>
+        <w:t xml:space="preserve">. Прорывное сочетание вычислительных мощностей и сетевых возможностей в наших системах-на-кристалле изменило ландшафт </w:t>
+      </w:r>
+      <w:proofErr w:type="spellStart"/>
+      <w:r>
+        <w:rPr>
+          <w:sz w:val="28"/>
+          <w:szCs w:val="28"/>
+        </w:rPr>
+        <w:t>IoT</w:t>
+      </w:r>
+      <w:proofErr w:type="spellEnd"/>
+      <w:r>
+        <w:rPr>
+          <w:sz w:val="28"/>
+          <w:szCs w:val="28"/>
+        </w:rPr>
+        <w:t>, сделав массовые умные устройства доступными для всех.</w:t>
       </w:r>
     </w:p>
     <w:p>
@@ -3504,7 +3523,23 @@
           <w:sz w:val="28"/>
           <w:szCs w:val="28"/>
         </w:rPr>
-        <w:t>Разработанный для мобильных устройств, носимой электроники и IoT-приложений, ESP32 достигает сверхнизкого энергопотребления за счет комбинации нескольких типов проприетарного программного обеспечения. ESP32 также включает передовые функции, такие как высокоточное стробирование тактового сигнала, различные режимы питания и динамическое масштабирование энергопотребления.</w:t>
+        <w:t xml:space="preserve">Разработанный для мобильных устройств, носимой электроники и </w:t>
+      </w:r>
+      <w:proofErr w:type="spellStart"/>
+      <w:r>
+        <w:rPr>
+          <w:sz w:val="28"/>
+          <w:szCs w:val="28"/>
+        </w:rPr>
+        <w:t>IoT</w:t>
+      </w:r>
+      <w:proofErr w:type="spellEnd"/>
+      <w:r>
+        <w:rPr>
+          <w:sz w:val="28"/>
+          <w:szCs w:val="28"/>
+        </w:rPr>
+        <w:t>-приложений, ESP32 достигает сверхнизкого энергопотребления за счет комбинации нескольких типов проприетарного программного обеспечения. ESP32 также включает передовые функции, такие как высокоточное стробирование тактового сигнала, различные режимы питания и динамическое масштабирование энергопотребления.</w:t>
       </w:r>
     </w:p>
     <w:p>
@@ -3521,7 +3556,23 @@
           <w:sz w:val="28"/>
           <w:szCs w:val="28"/>
         </w:rPr>
-        <w:t>ESP32 обладает высокой степенью интеграции благодаря встроенным антенным коммутаторам, радиочастотному симметрирующему трансформатору, усилителю мощности, малошумящему усилителю приемника, фильтрам и модулям управления питанием. ESP32 добавляет неоценимую функциональность и универсальность вашим приложениям при минимальных требованиях к занимаемой площади на печатной плате.</w:t>
+        <w:t xml:space="preserve">ESP32 обладает высокой степенью интеграции благодаря встроенным антенным коммутаторам, радиочастотному </w:t>
+      </w:r>
+      <w:proofErr w:type="spellStart"/>
+      <w:r>
+        <w:rPr>
+          <w:sz w:val="28"/>
+          <w:szCs w:val="28"/>
+        </w:rPr>
+        <w:t>симметрирующему</w:t>
+      </w:r>
+      <w:proofErr w:type="spellEnd"/>
+      <w:r>
+        <w:rPr>
+          <w:sz w:val="28"/>
+          <w:szCs w:val="28"/>
+        </w:rPr>
+        <w:t xml:space="preserve"> трансформатору, усилителю мощности, малошумящему усилителю приемника, фильтрам и модулям управления питанием. ESP32 добавляет неоценимую функциональность и универсальность вашим приложениям при минимальных требованиях к занимаемой площади на печатной плате.</w:t>
       </w:r>
     </w:p>
     <w:p>
@@ -3552,7 +3603,23 @@
           <w:sz w:val="28"/>
           <w:szCs w:val="28"/>
         </w:rPr>
-        <w:t>, снижая нагрузку по обработке коммуникационного стека на основной прикладной процессор. ESP32 способен взаимодействовать с другими системами, предоставляя функциональность Wi-Fi и Bluetooth через свои интерфейсы SPI / SDIO или I2C / UART</w:t>
+        <w:t xml:space="preserve">, снижая нагрузку по обработке коммуникационного стека на основной прикладной процессор. ESP32 способен взаимодействовать с другими системами, предоставляя функциональность </w:t>
+      </w:r>
+      <w:proofErr w:type="spellStart"/>
+      <w:r>
+        <w:rPr>
+          <w:sz w:val="28"/>
+          <w:szCs w:val="28"/>
+        </w:rPr>
+        <w:t>Wi</w:t>
+      </w:r>
+      <w:proofErr w:type="spellEnd"/>
+      <w:r>
+        <w:rPr>
+          <w:sz w:val="28"/>
+          <w:szCs w:val="28"/>
+        </w:rPr>
+        <w:t>-Fi и Bluetooth через свои интерфейсы SPI / SDIO или I2C / UART</w:t>
       </w:r>
       <w:r>
         <w:rPr>
@@ -3639,7 +3706,39 @@
           <w:sz w:val="28"/>
           <w:szCs w:val="28"/>
         </w:rPr>
-        <w:t>Датчик VL53L0X выполняет функцию лазерного дальномера для точного измерения расстояния до окружающих препятствий. Использование технологии Time-of-Flight делает точность измерений абсолютно независимой от цвета или фактуры объекта, а узкий направленный луч полностью исключает ложные срабатывания, свойственные широким ультразвуковым сонарам.</w:t>
+        <w:t>Датчик VL53L0X выполняет функцию лазерного дальномера для точного измерения расстояния до окружающих препятствий. Использование технологии Time-</w:t>
+      </w:r>
+      <w:proofErr w:type="spellStart"/>
+      <w:r>
+        <w:rPr>
+          <w:sz w:val="28"/>
+          <w:szCs w:val="28"/>
+        </w:rPr>
+        <w:t>of</w:t>
+      </w:r>
+      <w:proofErr w:type="spellEnd"/>
+      <w:r>
+        <w:rPr>
+          <w:sz w:val="28"/>
+          <w:szCs w:val="28"/>
+        </w:rPr>
+        <w:t>-</w:t>
+      </w:r>
+      <w:proofErr w:type="spellStart"/>
+      <w:r>
+        <w:rPr>
+          <w:sz w:val="28"/>
+          <w:szCs w:val="28"/>
+        </w:rPr>
+        <w:t>Flight</w:t>
+      </w:r>
+      <w:proofErr w:type="spellEnd"/>
+      <w:r>
+        <w:rPr>
+          <w:sz w:val="28"/>
+          <w:szCs w:val="28"/>
+        </w:rPr>
+        <w:t xml:space="preserve"> делает точность измерений абсолютно независимой от цвета или фактуры объекта, а узкий направленный луч полностью исключает ложные срабатывания, свойственные широким ультразвуковым сонарам.</w:t>
       </w:r>
     </w:p>
     <w:p>
@@ -3738,7 +3837,23 @@
           <w:sz w:val="28"/>
           <w:szCs w:val="28"/>
         </w:rPr>
-        <w:t>Пассивный пьезоизлучатель KY-006 выполняет роль системы акустического оповещения оператора о системных событиях. Пассивная архитектура мембраны позволяет генерировать звуки любой частоты с помощью ШИМ-сигнала (мелодии, сирены), в отличие от простых активных зуммеров, издающих только один монотонный писк.</w:t>
+        <w:t xml:space="preserve">Пассивный </w:t>
+      </w:r>
+      <w:proofErr w:type="spellStart"/>
+      <w:r>
+        <w:rPr>
+          <w:sz w:val="28"/>
+          <w:szCs w:val="28"/>
+        </w:rPr>
+        <w:t>пьезоизлучатель</w:t>
+      </w:r>
+      <w:proofErr w:type="spellEnd"/>
+      <w:r>
+        <w:rPr>
+          <w:sz w:val="28"/>
+          <w:szCs w:val="28"/>
+        </w:rPr>
+        <w:t xml:space="preserve"> KY-006 выполняет роль системы акустического оповещения оператора о системных событиях. Пассивная архитектура мембраны позволяет генерировать звуки любой частоты с помощью ШИМ-сигнала (мелодии, сирены), в отличие от простых активных зуммеров, издающих только один монотонный писк.</w:t>
       </w:r>
     </w:p>
     <w:p>
@@ -3845,12 +3960,37 @@
         </w:rPr>
         <w:t xml:space="preserve">такими как </w:t>
       </w:r>
-      <w:r>
-        <w:rPr>
-          <w:sz w:val="28"/>
-          <w:szCs w:val="28"/>
-        </w:rPr>
-        <w:t>Raspberry Pi, ESP32 обеспечивает жесткое реальное время, критически важное для синхронной генерации ШИМ-сигнала для сервоприводов, и потребляет значительно меньше энергии.</w:t>
+      <w:proofErr w:type="spellStart"/>
+      <w:r>
+        <w:rPr>
+          <w:sz w:val="28"/>
+          <w:szCs w:val="28"/>
+        </w:rPr>
+        <w:t>Raspberry</w:t>
+      </w:r>
+      <w:proofErr w:type="spellEnd"/>
+      <w:r>
+        <w:rPr>
+          <w:sz w:val="28"/>
+          <w:szCs w:val="28"/>
+        </w:rPr>
+        <w:t xml:space="preserve"> </w:t>
+      </w:r>
+      <w:proofErr w:type="spellStart"/>
+      <w:r>
+        <w:rPr>
+          <w:sz w:val="28"/>
+          <w:szCs w:val="28"/>
+        </w:rPr>
+        <w:t>Pi</w:t>
+      </w:r>
+      <w:proofErr w:type="spellEnd"/>
+      <w:r>
+        <w:rPr>
+          <w:sz w:val="28"/>
+          <w:szCs w:val="28"/>
+        </w:rPr>
+        <w:t>, ESP32 обеспечивает жесткое реальное время, критически важное для синхронной генерации ШИМ-сигнала для сервоприводов, и потребляет значительно меньше энергии.</w:t>
       </w:r>
     </w:p>
     <w:p>
@@ -4143,7 +4283,23 @@
           <w:sz w:val="28"/>
           <w:szCs w:val="28"/>
         </w:rPr>
-        <w:t>Низкоуровневая логика базируется на операционной системе реального времени FreeRTOS и написана на языке C.</w:t>
+        <w:t xml:space="preserve">Низкоуровневая логика базируется на операционной системе реального времени </w:t>
+      </w:r>
+      <w:proofErr w:type="spellStart"/>
+      <w:r>
+        <w:rPr>
+          <w:sz w:val="28"/>
+          <w:szCs w:val="28"/>
+        </w:rPr>
+        <w:t>FreeRTOS</w:t>
+      </w:r>
+      <w:proofErr w:type="spellEnd"/>
+      <w:r>
+        <w:rPr>
+          <w:sz w:val="28"/>
+          <w:szCs w:val="28"/>
+        </w:rPr>
+        <w:t xml:space="preserve"> и написана на языке C.</w:t>
       </w:r>
       <w:r>
         <w:rPr>
@@ -4218,8 +4374,17 @@
           <w:sz w:val="28"/>
           <w:szCs w:val="28"/>
         </w:rPr>
-        <w:t>, разработанное на базе фреймворка Vue.j</w:t>
-      </w:r>
+        <w:t xml:space="preserve">, разработанное на базе фреймворка </w:t>
+      </w:r>
+      <w:proofErr w:type="spellStart"/>
+      <w:r>
+        <w:rPr>
+          <w:sz w:val="28"/>
+          <w:szCs w:val="28"/>
+        </w:rPr>
+        <w:t>Vue.j</w:t>
+      </w:r>
+      <w:proofErr w:type="spellEnd"/>
       <w:r>
         <w:rPr>
           <w:sz w:val="28"/>
@@ -4271,8 +4436,17 @@
           <w:sz w:val="28"/>
           <w:szCs w:val="28"/>
         </w:rPr>
-        <w:t>Взаимодействие между уровнями реализовано поверх стека TCP/IP через протокол WebSocket</w:t>
-      </w:r>
+        <w:t xml:space="preserve">Взаимодействие между уровнями реализовано поверх стека TCP/IP через протокол </w:t>
+      </w:r>
+      <w:proofErr w:type="spellStart"/>
+      <w:r>
+        <w:rPr>
+          <w:sz w:val="28"/>
+          <w:szCs w:val="28"/>
+        </w:rPr>
+        <w:t>WebSocket</w:t>
+      </w:r>
+      <w:proofErr w:type="spellEnd"/>
       <w:r>
         <w:rPr>
           <w:sz w:val="28"/>
@@ -4280,6 +4454,7 @@
         </w:rPr>
         <w:t xml:space="preserve"> с помощью библиотеки </w:t>
       </w:r>
+      <w:proofErr w:type="spellStart"/>
       <w:r>
         <w:rPr>
           <w:sz w:val="28"/>
@@ -4288,6 +4463,7 @@
         </w:rPr>
         <w:t>esp</w:t>
       </w:r>
+      <w:proofErr w:type="spellEnd"/>
       <w:r>
         <w:rPr>
           <w:sz w:val="28"/>
@@ -4392,12 +4568,21 @@
           <w:szCs w:val="28"/>
         </w:rPr>
       </w:pPr>
-      <w:r>
-        <w:rPr>
-          <w:sz w:val="28"/>
-          <w:szCs w:val="28"/>
-        </w:rPr>
-        <w:t xml:space="preserve">FreeRTOS является индустриальным стандартом операционных систем для встраиваемых устройств, обеспечивающим предсказуемое вытесняющее планирование задач. </w:t>
+      <w:proofErr w:type="spellStart"/>
+      <w:r>
+        <w:rPr>
+          <w:sz w:val="28"/>
+          <w:szCs w:val="28"/>
+        </w:rPr>
+        <w:t>FreeRTOS</w:t>
+      </w:r>
+      <w:proofErr w:type="spellEnd"/>
+      <w:r>
+        <w:rPr>
+          <w:sz w:val="28"/>
+          <w:szCs w:val="28"/>
+        </w:rPr>
+        <w:t xml:space="preserve"> является индустриальным стандартом операционных систем для встраиваемых устройств, обеспечивающим предсказуемое вытесняющее планирование задач. </w:t>
       </w:r>
     </w:p>
     <w:p>
@@ -4477,7 +4662,23 @@
           <w:sz w:val="28"/>
           <w:szCs w:val="28"/>
         </w:rPr>
-        <w:t xml:space="preserve"> ОСРВ, такие как FreeRTOS, достигают этого за счет назначения строгого приоритета каждой задач</w:t>
+        <w:t xml:space="preserve"> ОСРВ, такие как </w:t>
+      </w:r>
+      <w:proofErr w:type="spellStart"/>
+      <w:r>
+        <w:rPr>
+          <w:sz w:val="28"/>
+          <w:szCs w:val="28"/>
+        </w:rPr>
+        <w:t>FreeRTOS</w:t>
+      </w:r>
+      <w:proofErr w:type="spellEnd"/>
+      <w:r>
+        <w:rPr>
+          <w:sz w:val="28"/>
+          <w:szCs w:val="28"/>
+        </w:rPr>
+        <w:t>, достигают этого за счет назначения строгого приоритета каждой задач</w:t>
       </w:r>
       <w:r>
         <w:rPr>
@@ -4503,6 +4704,7 @@
           <w:szCs w:val="28"/>
         </w:rPr>
       </w:pPr>
+      <w:proofErr w:type="spellStart"/>
       <w:r>
         <w:rPr>
           <w:sz w:val="28"/>
@@ -4510,6 +4712,7 @@
         </w:rPr>
         <w:t>FreeRTOS</w:t>
       </w:r>
+      <w:proofErr w:type="spellEnd"/>
       <w:r>
         <w:rPr>
           <w:sz w:val="28"/>
@@ -4722,7 +4925,39 @@
           <w:sz w:val="28"/>
           <w:szCs w:val="28"/>
         </w:rPr>
-        <w:t xml:space="preserve">ESP-IDF (Espressif IoT Development Framework) </w:t>
+        <w:t>ESP-IDF (</w:t>
+      </w:r>
+      <w:proofErr w:type="spellStart"/>
+      <w:r>
+        <w:rPr>
+          <w:sz w:val="28"/>
+          <w:szCs w:val="28"/>
+        </w:rPr>
+        <w:t>Espressif</w:t>
+      </w:r>
+      <w:proofErr w:type="spellEnd"/>
+      <w:r>
+        <w:rPr>
+          <w:sz w:val="28"/>
+          <w:szCs w:val="28"/>
+        </w:rPr>
+        <w:t xml:space="preserve"> </w:t>
+      </w:r>
+      <w:proofErr w:type="spellStart"/>
+      <w:r>
+        <w:rPr>
+          <w:sz w:val="28"/>
+          <w:szCs w:val="28"/>
+        </w:rPr>
+        <w:t>IoT</w:t>
+      </w:r>
+      <w:proofErr w:type="spellEnd"/>
+      <w:r>
+        <w:rPr>
+          <w:sz w:val="28"/>
+          <w:szCs w:val="28"/>
+        </w:rPr>
+        <w:t xml:space="preserve"> Development Framework) </w:t>
       </w:r>
       <w:r>
         <w:rPr>
@@ -4736,7 +4971,39 @@
           <w:sz w:val="28"/>
           <w:szCs w:val="28"/>
         </w:rPr>
-        <w:t xml:space="preserve"> это официальный SDK промышленного уровня для всех систем-на-кристалле компании Espressif. Он объединяет драйверы, сетевые стеки, инструменты безопасности и систему сборки, позволяя разрабатывать решения любой сложности: от простых датчиков до сертифицированных устройств Matter и систем с периферийным ИИ.</w:t>
+        <w:t xml:space="preserve"> это официальный SDK промышленного уровня для всех систем-на-кристалле компании </w:t>
+      </w:r>
+      <w:proofErr w:type="spellStart"/>
+      <w:r>
+        <w:rPr>
+          <w:sz w:val="28"/>
+          <w:szCs w:val="28"/>
+        </w:rPr>
+        <w:t>Espressif</w:t>
+      </w:r>
+      <w:proofErr w:type="spellEnd"/>
+      <w:r>
+        <w:rPr>
+          <w:sz w:val="28"/>
+          <w:szCs w:val="28"/>
+        </w:rPr>
+        <w:t xml:space="preserve">. Он объединяет драйверы, сетевые стеки, инструменты безопасности и систему сборки, позволяя разрабатывать решения любой сложности: от простых датчиков до сертифицированных устройств </w:t>
+      </w:r>
+      <w:proofErr w:type="spellStart"/>
+      <w:r>
+        <w:rPr>
+          <w:sz w:val="28"/>
+          <w:szCs w:val="28"/>
+        </w:rPr>
+        <w:t>Matter</w:t>
+      </w:r>
+      <w:proofErr w:type="spellEnd"/>
+      <w:r>
+        <w:rPr>
+          <w:sz w:val="28"/>
+          <w:szCs w:val="28"/>
+        </w:rPr>
+        <w:t xml:space="preserve"> и систем с периферийным ИИ.</w:t>
       </w:r>
     </w:p>
     <w:p>
@@ -4753,7 +5020,39 @@
           <w:sz w:val="28"/>
           <w:szCs w:val="28"/>
         </w:rPr>
-        <w:t>Главное преимущество ESP-IDF заключается в универсальности: единые API и система сборки работают со всеми линейками чипов Espressif. Это позволяет легко переходить на новые или более доступные микроконтроллеры без переписывания прикладного кода. Фреймворк имеет открытый исходный код, поддерживается мировым сообществом на GitHub и успешно применяется в более чем миллиарде устройств по всему миру.</w:t>
+        <w:t xml:space="preserve">Главное преимущество ESP-IDF заключается в универсальности: единые API и система сборки работают со всеми линейками чипов </w:t>
+      </w:r>
+      <w:proofErr w:type="spellStart"/>
+      <w:r>
+        <w:rPr>
+          <w:sz w:val="28"/>
+          <w:szCs w:val="28"/>
+        </w:rPr>
+        <w:t>Espressif</w:t>
+      </w:r>
+      <w:proofErr w:type="spellEnd"/>
+      <w:r>
+        <w:rPr>
+          <w:sz w:val="28"/>
+          <w:szCs w:val="28"/>
+        </w:rPr>
+        <w:t xml:space="preserve">. Это позволяет легко переходить на новые или более доступные микроконтроллеры без переписывания прикладного кода. Фреймворк имеет открытый исходный код, поддерживается мировым сообществом на </w:t>
+      </w:r>
+      <w:proofErr w:type="spellStart"/>
+      <w:r>
+        <w:rPr>
+          <w:sz w:val="28"/>
+          <w:szCs w:val="28"/>
+        </w:rPr>
+        <w:t>GitHub</w:t>
+      </w:r>
+      <w:proofErr w:type="spellEnd"/>
+      <w:r>
+        <w:rPr>
+          <w:sz w:val="28"/>
+          <w:szCs w:val="28"/>
+        </w:rPr>
+        <w:t xml:space="preserve"> и успешно применяется в более чем миллиарде устройств по всему миру.</w:t>
       </w:r>
     </w:p>
     <w:p>
@@ -4853,7 +5152,39 @@
           <w:sz w:val="28"/>
           <w:szCs w:val="28"/>
         </w:rPr>
-        <w:t xml:space="preserve"> это прогрессивный фреймворк для фронтенд-разработки, отличающийся высокой гибкостью и возможностью постепенного внедрения. В зависимости от масштаба и специфики проекта, Vue поддерживает множество подходов: от простого расширения статического HTML без сборки и интеграции Web-компонентов до разработки сложных одностраничных приложений, серверного рендеринга, генерации статических сайтов и даже создания интерфейсов для десктопа, мобильных устройств и WebGL.</w:t>
+        <w:t xml:space="preserve"> это прогрессивный фреймворк для фронтенд-разработки, отличающийся высокой гибкостью и возможностью постепенного внедрения. В зависимости от масштаба и специфики проекта, </w:t>
+      </w:r>
+      <w:proofErr w:type="spellStart"/>
+      <w:r>
+        <w:rPr>
+          <w:sz w:val="28"/>
+          <w:szCs w:val="28"/>
+        </w:rPr>
+        <w:t>Vue</w:t>
+      </w:r>
+      <w:proofErr w:type="spellEnd"/>
+      <w:r>
+        <w:rPr>
+          <w:sz w:val="28"/>
+          <w:szCs w:val="28"/>
+        </w:rPr>
+        <w:t xml:space="preserve"> поддерживает множество подходов: от простого расширения статического HTML без сборки и интеграции Web-компонентов до разработки сложных одностраничных приложений, серверного рендеринга, генерации статических сайтов и даже создания интерфейсов для десктопа, мобильных устройств и </w:t>
+      </w:r>
+      <w:proofErr w:type="spellStart"/>
+      <w:r>
+        <w:rPr>
+          <w:sz w:val="28"/>
+          <w:szCs w:val="28"/>
+        </w:rPr>
+        <w:t>WebGL</w:t>
+      </w:r>
+      <w:proofErr w:type="spellEnd"/>
+      <w:r>
+        <w:rPr>
+          <w:sz w:val="28"/>
+          <w:szCs w:val="28"/>
+        </w:rPr>
+        <w:t>.</w:t>
       </w:r>
     </w:p>
     <w:p>
@@ -4870,7 +5201,23 @@
           <w:sz w:val="28"/>
           <w:szCs w:val="28"/>
         </w:rPr>
-        <w:t>Концепция «прогрессивного фреймворка» означает, что Vue адаптируется под растущие потребности проекта. Базовые принципы его работы</w:t>
+        <w:t xml:space="preserve">Концепция «прогрессивного фреймворка» означает, что </w:t>
+      </w:r>
+      <w:proofErr w:type="spellStart"/>
+      <w:r>
+        <w:rPr>
+          <w:sz w:val="28"/>
+          <w:szCs w:val="28"/>
+        </w:rPr>
+        <w:t>Vue</w:t>
+      </w:r>
+      <w:proofErr w:type="spellEnd"/>
+      <w:r>
+        <w:rPr>
+          <w:sz w:val="28"/>
+          <w:szCs w:val="28"/>
+        </w:rPr>
+        <w:t xml:space="preserve"> адаптируется под растущие потребности проекта. Базовые принципы его работы</w:t>
       </w:r>
       <w:r>
         <w:rPr>
@@ -4959,7 +5306,39 @@
           <w:sz w:val="28"/>
           <w:szCs w:val="28"/>
         </w:rPr>
-        <w:t>Выбор официального фреймворка ESP-IDF в качестве базовой среды разработки, в отличие от популярной платформы Arduino IDE или интерпретируемого MicroPython, обусловлен необходимостью детерминированного управления ресурсами системы на низком уровне.</w:t>
+        <w:t xml:space="preserve">Выбор официального фреймворка ESP-IDF в качестве базовой среды разработки, в отличие от популярной платформы </w:t>
+      </w:r>
+      <w:proofErr w:type="spellStart"/>
+      <w:r>
+        <w:rPr>
+          <w:sz w:val="28"/>
+          <w:szCs w:val="28"/>
+        </w:rPr>
+        <w:t>Arduino</w:t>
+      </w:r>
+      <w:proofErr w:type="spellEnd"/>
+      <w:r>
+        <w:rPr>
+          <w:sz w:val="28"/>
+          <w:szCs w:val="28"/>
+        </w:rPr>
+        <w:t xml:space="preserve"> IDE или интерпретируемого </w:t>
+      </w:r>
+      <w:proofErr w:type="spellStart"/>
+      <w:r>
+        <w:rPr>
+          <w:sz w:val="28"/>
+          <w:szCs w:val="28"/>
+        </w:rPr>
+        <w:t>MicroPython</w:t>
+      </w:r>
+      <w:proofErr w:type="spellEnd"/>
+      <w:r>
+        <w:rPr>
+          <w:sz w:val="28"/>
+          <w:szCs w:val="28"/>
+        </w:rPr>
+        <w:t>, обусловлен необходимостью детерминированного управления ресурсами системы на низком уровне.</w:t>
       </w:r>
     </w:p>
     <w:p>
@@ -4976,7 +5355,23 @@
           <w:sz w:val="28"/>
           <w:szCs w:val="28"/>
         </w:rPr>
-        <w:t xml:space="preserve">Высокоуровневые абстракции сторонних сред вносят непредсказуемые программные задержки и ограничивают контроль над внутренними механизмами операционной системы. ESP-IDF предоставляет прямой нативный доступ к API ядра FreeRTOS, что позволяет реализовать тонкую настройку планировщика, распределить вычислительные потоки строго между физическими ядрами микроконтроллера и управлять приоритетами задач. Отказ от избыточных программных прослоек критически важен для обеспечения стабильного цикла расчета инверсной кинематики с жесткой </w:t>
+        <w:t xml:space="preserve">Высокоуровневые абстракции сторонних сред вносят непредсказуемые программные задержки и ограничивают контроль над внутренними механизмами операционной системы. ESP-IDF предоставляет прямой нативный доступ к API ядра </w:t>
+      </w:r>
+      <w:proofErr w:type="spellStart"/>
+      <w:r>
+        <w:rPr>
+          <w:sz w:val="28"/>
+          <w:szCs w:val="28"/>
+        </w:rPr>
+        <w:t>FreeRTOS</w:t>
+      </w:r>
+      <w:proofErr w:type="spellEnd"/>
+      <w:r>
+        <w:rPr>
+          <w:sz w:val="28"/>
+          <w:szCs w:val="28"/>
+        </w:rPr>
+        <w:t xml:space="preserve">, что позволяет реализовать тонкую настройку планировщика, распределить вычислительные потоки строго между физическими ядрами микроконтроллера и управлять приоритетами задач. Отказ от избыточных программных прослоек критически важен для обеспечения стабильного цикла расчета инверсной кинематики с жесткой </w:t>
       </w:r>
       <w:r>
         <w:rPr>
@@ -4984,7 +5379,23 @@
           <w:szCs w:val="28"/>
         </w:rPr>
         <w:lastRenderedPageBreak/>
-        <w:t>частотой 50 Гц и параллельной безотказной работы сетевого стека WebSocket без взаимных блокировок.</w:t>
+        <w:t xml:space="preserve">частотой 50 Гц и параллельной безотказной работы сетевого стека </w:t>
+      </w:r>
+      <w:proofErr w:type="spellStart"/>
+      <w:r>
+        <w:rPr>
+          <w:sz w:val="28"/>
+          <w:szCs w:val="28"/>
+        </w:rPr>
+        <w:t>WebSocket</w:t>
+      </w:r>
+      <w:proofErr w:type="spellEnd"/>
+      <w:r>
+        <w:rPr>
+          <w:sz w:val="28"/>
+          <w:szCs w:val="28"/>
+        </w:rPr>
+        <w:t xml:space="preserve"> без взаимных блокировок.</w:t>
       </w:r>
     </w:p>
     <w:p>
@@ -5001,7 +5412,23 @@
           <w:sz w:val="28"/>
           <w:szCs w:val="28"/>
         </w:rPr>
-        <w:t>Выбор экосистемы Vue.js в связке со сборщиком Vite, в противовес классической веб-разработке или тяжеловесным фреймворкам, продиктован балансом между архитектурной сложностью интерфейса и строгими аппаратными ограничениями встраиваемой системы.</w:t>
+        <w:t xml:space="preserve">Выбор экосистемы Vue.js в связке со сборщиком </w:t>
+      </w:r>
+      <w:proofErr w:type="spellStart"/>
+      <w:r>
+        <w:rPr>
+          <w:sz w:val="28"/>
+          <w:szCs w:val="28"/>
+        </w:rPr>
+        <w:t>Vite</w:t>
+      </w:r>
+      <w:proofErr w:type="spellEnd"/>
+      <w:r>
+        <w:rPr>
+          <w:sz w:val="28"/>
+          <w:szCs w:val="28"/>
+        </w:rPr>
+        <w:t>, в противовес классической веб-разработке или тяжеловесным фреймворкам, продиктован балансом между архитектурной сложностью интерфейса и строгими аппаратными ограничениями встраиваемой системы.</w:t>
       </w:r>
     </w:p>
     <w:p>
@@ -5018,7 +5445,71 @@
           <w:sz w:val="28"/>
           <w:szCs w:val="28"/>
         </w:rPr>
-        <w:t>Традиционный подход на базе чистого JavaScript приводит к неструктурированному и трудноподдерживаемому коду при необходимости синхронизации сложного динамического состояния (обработка событий виртуальных джойстиков, отрисовка графиков телеметрии, управление разрывами WebSocket-соединения). В свою очередь, применение корпоративных решений уровня Angular избыточно: их объемный рантайм генерирует слишком большие итоговые сборки, нецелесообразные для хранения в ограниченной Flash-памяти микроконтроллера.</w:t>
+        <w:t xml:space="preserve">Традиционный подход на базе чистого JavaScript приводит к неструктурированному и </w:t>
+      </w:r>
+      <w:proofErr w:type="spellStart"/>
+      <w:r>
+        <w:rPr>
+          <w:sz w:val="28"/>
+          <w:szCs w:val="28"/>
+        </w:rPr>
+        <w:t>трудноподдерживаемому</w:t>
+      </w:r>
+      <w:proofErr w:type="spellEnd"/>
+      <w:r>
+        <w:rPr>
+          <w:sz w:val="28"/>
+          <w:szCs w:val="28"/>
+        </w:rPr>
+        <w:t xml:space="preserve"> коду при необходимости синхронизации сложного динамического состояния (обработка событий виртуальных джойстиков, отрисовка графиков телеметрии, управление разрывами </w:t>
+      </w:r>
+      <w:proofErr w:type="spellStart"/>
+      <w:r>
+        <w:rPr>
+          <w:sz w:val="28"/>
+          <w:szCs w:val="28"/>
+        </w:rPr>
+        <w:t>WebSocket</w:t>
+      </w:r>
+      <w:proofErr w:type="spellEnd"/>
+      <w:r>
+        <w:rPr>
+          <w:sz w:val="28"/>
+          <w:szCs w:val="28"/>
+        </w:rPr>
+        <w:t xml:space="preserve">-соединения). В свою очередь, применение корпоративных решений уровня </w:t>
+      </w:r>
+      <w:proofErr w:type="spellStart"/>
+      <w:r>
+        <w:rPr>
+          <w:sz w:val="28"/>
+          <w:szCs w:val="28"/>
+        </w:rPr>
+        <w:t>Angular</w:t>
+      </w:r>
+      <w:proofErr w:type="spellEnd"/>
+      <w:r>
+        <w:rPr>
+          <w:sz w:val="28"/>
+          <w:szCs w:val="28"/>
+        </w:rPr>
+        <w:t xml:space="preserve"> избыточно: их объемный </w:t>
+      </w:r>
+      <w:proofErr w:type="spellStart"/>
+      <w:r>
+        <w:rPr>
+          <w:sz w:val="28"/>
+          <w:szCs w:val="28"/>
+        </w:rPr>
+        <w:t>рантайм</w:t>
+      </w:r>
+      <w:proofErr w:type="spellEnd"/>
+      <w:r>
+        <w:rPr>
+          <w:sz w:val="28"/>
+          <w:szCs w:val="28"/>
+        </w:rPr>
+        <w:t xml:space="preserve"> генерирует слишком большие итоговые сборки, нецелесообразные для хранения в ограниченной Flash-памяти микроконтроллера.</w:t>
       </w:r>
     </w:p>
     <w:p>
@@ -5049,7 +5540,23 @@
           <w:sz w:val="28"/>
           <w:szCs w:val="28"/>
         </w:rPr>
-        <w:t>. Использование высокопроизводительного сборщика Vite с алгоритмами удаления неиспользуемого кода позволяет скомпилировать весь проект в единый минимизированный пакет. Последующее</w:t>
+        <w:t xml:space="preserve">. Использование высокопроизводительного сборщика </w:t>
+      </w:r>
+      <w:proofErr w:type="spellStart"/>
+      <w:r>
+        <w:rPr>
+          <w:sz w:val="28"/>
+          <w:szCs w:val="28"/>
+        </w:rPr>
+        <w:t>Vite</w:t>
+      </w:r>
+      <w:proofErr w:type="spellEnd"/>
+      <w:r>
+        <w:rPr>
+          <w:sz w:val="28"/>
+          <w:szCs w:val="28"/>
+        </w:rPr>
+        <w:t xml:space="preserve"> с алгоритмами удаления неиспользуемого кода позволяет скомпилировать весь проект в единый минимизированный пакет. Последующее</w:t>
       </w:r>
       <w:r>
         <w:rPr>
@@ -5157,7 +5664,25 @@
           <w:szCs w:val="28"/>
           <w:lang w:eastAsia="ru-RU"/>
         </w:rPr>
-        <w:t xml:space="preserve"> функционирует на стыке жесткого реального времени и асинхронных сетевых веб-технологий. Базовым уровнем программной архитектуры выступает операционная система реального времени FreeRTOS. Её применение продиктовано необходимостью строгого разделения вычислительных процессов между двумя ядрами микроконтроллера.</w:t>
+        <w:t xml:space="preserve"> функционирует на стыке жесткого реального времени и асинхронных сетевых веб-технологий. Базовым уровнем программной архитектуры выступает операционная система реального времени </w:t>
+      </w:r>
+      <w:proofErr w:type="spellStart"/>
+      <w:r>
+        <w:rPr>
+          <w:sz w:val="28"/>
+          <w:szCs w:val="28"/>
+          <w:lang w:eastAsia="ru-RU"/>
+        </w:rPr>
+        <w:t>FreeRTOS</w:t>
+      </w:r>
+      <w:proofErr w:type="spellEnd"/>
+      <w:r>
+        <w:rPr>
+          <w:sz w:val="28"/>
+          <w:szCs w:val="28"/>
+          <w:lang w:eastAsia="ru-RU"/>
+        </w:rPr>
+        <w:t>. Её применение продиктовано необходимостью строгого разделения вычислительных процессов между двумя ядрами микроконтроллера.</w:t>
       </w:r>
     </w:p>
     <w:p>
@@ -5181,14 +5706,50 @@
           <w:szCs w:val="28"/>
           <w:lang w:eastAsia="ru-RU"/>
         </w:rPr>
-        <w:t>Планировщик FreeRTOS позволяет организовать детерминированную многопоточную среду, где критически важные задачи получают наивысший приоритет и выполняются на прикладном ядре. Менее критичные процессы, включая обслуживание Wi-Fi соединения и отдачу файлов, изолируются на системном ядр</w:t>
-      </w:r>
+        <w:t xml:space="preserve">Планировщик </w:t>
+      </w:r>
+      <w:proofErr w:type="spellStart"/>
       <w:r>
         <w:rPr>
           <w:sz w:val="28"/>
           <w:szCs w:val="28"/>
           <w:lang w:eastAsia="ru-RU"/>
         </w:rPr>
+        <w:t>FreeRTOS</w:t>
+      </w:r>
+      <w:proofErr w:type="spellEnd"/>
+      <w:r>
+        <w:rPr>
+          <w:sz w:val="28"/>
+          <w:szCs w:val="28"/>
+          <w:lang w:eastAsia="ru-RU"/>
+        </w:rPr>
+        <w:t xml:space="preserve"> позволяет организовать детерминированную многопоточную среду, где критически важные задачи получают наивысший приоритет и выполняются на прикладном ядре. Менее критичные процессы, включая обслуживание </w:t>
+      </w:r>
+      <w:proofErr w:type="spellStart"/>
+      <w:r>
+        <w:rPr>
+          <w:sz w:val="28"/>
+          <w:szCs w:val="28"/>
+          <w:lang w:eastAsia="ru-RU"/>
+        </w:rPr>
+        <w:t>Wi</w:t>
+      </w:r>
+      <w:proofErr w:type="spellEnd"/>
+      <w:r>
+        <w:rPr>
+          <w:sz w:val="28"/>
+          <w:szCs w:val="28"/>
+          <w:lang w:eastAsia="ru-RU"/>
+        </w:rPr>
+        <w:t>-Fi соединения и отдачу файлов, изолируются на системном ядр</w:t>
+      </w:r>
+      <w:r>
+        <w:rPr>
+          <w:sz w:val="28"/>
+          <w:szCs w:val="28"/>
+          <w:lang w:eastAsia="ru-RU"/>
+        </w:rPr>
         <w:t>е</w:t>
       </w:r>
       <w:r>
@@ -5197,7 +5758,25 @@
           <w:szCs w:val="28"/>
           <w:lang w:eastAsia="ru-RU"/>
         </w:rPr>
-        <w:t xml:space="preserve">. Взаимодействие между этими асинхронными потоками реализуется через встроенные потокобезопасные структуры данных </w:t>
+        <w:t xml:space="preserve">. Взаимодействие между этими асинхронными потоками реализуется через встроенные </w:t>
+      </w:r>
+      <w:proofErr w:type="spellStart"/>
+      <w:r>
+        <w:rPr>
+          <w:sz w:val="28"/>
+          <w:szCs w:val="28"/>
+          <w:lang w:eastAsia="ru-RU"/>
+        </w:rPr>
+        <w:t>потокобезопасные</w:t>
+      </w:r>
+      <w:proofErr w:type="spellEnd"/>
+      <w:r>
+        <w:rPr>
+          <w:sz w:val="28"/>
+          <w:szCs w:val="28"/>
+          <w:lang w:eastAsia="ru-RU"/>
+        </w:rPr>
+        <w:t xml:space="preserve"> структуры данных </w:t>
       </w:r>
       <w:r>
         <w:rPr>
@@ -5310,7 +5889,61 @@
           <w:szCs w:val="28"/>
           <w:lang w:eastAsia="ru-RU"/>
         </w:rPr>
-        <w:t>Связующим звеном между аппаратной частью микроконтроллера и пользовательским интерфейсом выступает сетевой стек, реализованный на базе протокола WebSocket. В отличие от классического HTTP-опроса, требующего постоянной установки новых соединений, WebSocket обеспечивает постоянный двунаправленный TCP-канал с минимальными задержками (latency), не превышающими 5–15 миллисекунд. Программный обработчик на стороне ESP32 асинхронно принимает векторы движения с виртуальных джойстиков и транслирует их в очередь для кинематического алгоритма, одновременно отправляя клиенту телеметрию</w:t>
+        <w:t xml:space="preserve">Связующим звеном между аппаратной частью микроконтроллера и пользовательским интерфейсом выступает сетевой стек, реализованный на базе протокола </w:t>
+      </w:r>
+      <w:proofErr w:type="spellStart"/>
+      <w:r>
+        <w:rPr>
+          <w:sz w:val="28"/>
+          <w:szCs w:val="28"/>
+          <w:lang w:eastAsia="ru-RU"/>
+        </w:rPr>
+        <w:t>WebSocket</w:t>
+      </w:r>
+      <w:proofErr w:type="spellEnd"/>
+      <w:r>
+        <w:rPr>
+          <w:sz w:val="28"/>
+          <w:szCs w:val="28"/>
+          <w:lang w:eastAsia="ru-RU"/>
+        </w:rPr>
+        <w:t xml:space="preserve">. В отличие от классического HTTP-опроса, требующего постоянной установки новых соединений, </w:t>
+      </w:r>
+      <w:proofErr w:type="spellStart"/>
+      <w:r>
+        <w:rPr>
+          <w:sz w:val="28"/>
+          <w:szCs w:val="28"/>
+          <w:lang w:eastAsia="ru-RU"/>
+        </w:rPr>
+        <w:t>WebSocket</w:t>
+      </w:r>
+      <w:proofErr w:type="spellEnd"/>
+      <w:r>
+        <w:rPr>
+          <w:sz w:val="28"/>
+          <w:szCs w:val="28"/>
+          <w:lang w:eastAsia="ru-RU"/>
+        </w:rPr>
+        <w:t xml:space="preserve"> обеспечивает постоянный двунаправленный TCP-канал с минимальными задержками (</w:t>
+      </w:r>
+      <w:proofErr w:type="spellStart"/>
+      <w:r>
+        <w:rPr>
+          <w:sz w:val="28"/>
+          <w:szCs w:val="28"/>
+          <w:lang w:eastAsia="ru-RU"/>
+        </w:rPr>
+        <w:t>latency</w:t>
+      </w:r>
+      <w:proofErr w:type="spellEnd"/>
+      <w:r>
+        <w:rPr>
+          <w:sz w:val="28"/>
+          <w:szCs w:val="28"/>
+          <w:lang w:eastAsia="ru-RU"/>
+        </w:rPr>
+        <w:t>), не превышающими 5–15 миллисекунд. Программный обработчик на стороне ESP32 асинхронно принимает векторы движения с виртуальных джойстиков и транслирует их в очередь для кинематического алгоритма, одновременно отправляя клиенту телеметрию</w:t>
       </w:r>
       <w:r>
         <w:rPr>
@@ -5342,7 +5975,43 @@
           <w:szCs w:val="28"/>
           <w:lang w:eastAsia="ru-RU"/>
         </w:rPr>
-        <w:t>Хранение и передача пользовательского интерфейса реализованы с использованием встроенной легковесной файловой системы LittleFS, специально разработанной для микроконтроллеров. Поскольку объем Flash-памяти ограничен, программное обеспечение встроенного веб-сервера настроено на работу с предварительно сжатыми файлами. При поступлении запроса от клиента микроконтроллер не тратит процессорное время на архивацию, а отдает готовый поток данных в формате Gzip, устанавливая соответствующий HTTP-заголовок. Этот механизм программной оптимизации позволяет разместить весь графический интерфейс в объеме нескольких десятков килобайт, оставляя пространство для системных логов и таблиц калибровок сервоприводов.</w:t>
+        <w:t xml:space="preserve">Хранение и передача пользовательского интерфейса реализованы с использованием встроенной легковесной файловой системы </w:t>
+      </w:r>
+      <w:proofErr w:type="spellStart"/>
+      <w:r>
+        <w:rPr>
+          <w:sz w:val="28"/>
+          <w:szCs w:val="28"/>
+          <w:lang w:eastAsia="ru-RU"/>
+        </w:rPr>
+        <w:t>LittleFS</w:t>
+      </w:r>
+      <w:proofErr w:type="spellEnd"/>
+      <w:r>
+        <w:rPr>
+          <w:sz w:val="28"/>
+          <w:szCs w:val="28"/>
+          <w:lang w:eastAsia="ru-RU"/>
+        </w:rPr>
+        <w:t xml:space="preserve">, специально разработанной для микроконтроллеров. Поскольку объем Flash-памяти ограничен, программное обеспечение встроенного веб-сервера настроено на работу с предварительно сжатыми файлами. При поступлении запроса от клиента микроконтроллер не тратит процессорное время на архивацию, а отдает готовый поток данных в формате </w:t>
+      </w:r>
+      <w:proofErr w:type="spellStart"/>
+      <w:r>
+        <w:rPr>
+          <w:sz w:val="28"/>
+          <w:szCs w:val="28"/>
+          <w:lang w:eastAsia="ru-RU"/>
+        </w:rPr>
+        <w:t>Gzip</w:t>
+      </w:r>
+      <w:proofErr w:type="spellEnd"/>
+      <w:r>
+        <w:rPr>
+          <w:sz w:val="28"/>
+          <w:szCs w:val="28"/>
+          <w:lang w:eastAsia="ru-RU"/>
+        </w:rPr>
+        <w:t>, устанавливая соответствующий HTTP-заголовок. Этот механизм программной оптимизации позволяет разместить весь графический интерфейс в объеме нескольких десятков килобайт, оставляя пространство для системных логов и таблиц калибровок сервоприводов.</w:t>
       </w:r>
     </w:p>
     <w:p>
@@ -5398,14 +6067,32 @@
           <w:szCs w:val="28"/>
           <w:lang w:eastAsia="ru-RU"/>
         </w:rPr>
-        <w:t xml:space="preserve"> Vite, интерфейс панели управления загружается в оперативную память браузера единожды. Вся последующая логика работы приложения </w:t>
-      </w:r>
+        <w:t xml:space="preserve"> </w:t>
+      </w:r>
+      <w:proofErr w:type="spellStart"/>
       <w:r>
         <w:rPr>
           <w:sz w:val="28"/>
           <w:szCs w:val="28"/>
           <w:lang w:eastAsia="ru-RU"/>
         </w:rPr>
+        <w:t>Vite</w:t>
+      </w:r>
+      <w:proofErr w:type="spellEnd"/>
+      <w:r>
+        <w:rPr>
+          <w:sz w:val="28"/>
+          <w:szCs w:val="28"/>
+          <w:lang w:eastAsia="ru-RU"/>
+        </w:rPr>
+        <w:t xml:space="preserve">, интерфейс панели управления загружается в оперативную память браузера единожды. Вся последующая логика работы приложения </w:t>
+      </w:r>
+      <w:r>
+        <w:rPr>
+          <w:sz w:val="28"/>
+          <w:szCs w:val="28"/>
+          <w:lang w:eastAsia="ru-RU"/>
+        </w:rPr>
         <w:t>–</w:t>
       </w:r>
       <w:r>
@@ -5430,7 +6117,25 @@
           <w:szCs w:val="28"/>
           <w:lang w:eastAsia="ru-RU"/>
         </w:rPr>
-        <w:t xml:space="preserve"> выполняется локально мощностями смартфона или компьютера оператора. Реактивная модель данных Vue.js обеспечивает мгновенную синхронизацию входящего потока телеметрии по WebSocket с визуальным представление. Такой архитектурный подход полностью разгружает вычислительную систему от задач рендеринга, позволяя процессору сосредоточиться исключительно на физике движения и поддержании баланса.</w:t>
+        <w:t xml:space="preserve"> выполняется локально мощностями смартфона или компьютера оператора. Реактивная модель данных Vue.js обеспечивает мгновенную синхронизацию входящего потока телеметрии по </w:t>
+      </w:r>
+      <w:proofErr w:type="spellStart"/>
+      <w:r>
+        <w:rPr>
+          <w:sz w:val="28"/>
+          <w:szCs w:val="28"/>
+          <w:lang w:eastAsia="ru-RU"/>
+        </w:rPr>
+        <w:t>WebSocket</w:t>
+      </w:r>
+      <w:proofErr w:type="spellEnd"/>
+      <w:r>
+        <w:rPr>
+          <w:sz w:val="28"/>
+          <w:szCs w:val="28"/>
+          <w:lang w:eastAsia="ru-RU"/>
+        </w:rPr>
+        <w:t xml:space="preserve"> с визуальным представление. Такой архитектурный подход полностью разгружает вычислительную систему от задач рендеринга, позволяя процессору сосредоточиться исключительно на физике движения и поддержании баланса.</w:t>
       </w:r>
     </w:p>
     <w:p>
@@ -5789,6 +6494,7 @@
           </w:rPr>
           <w:t>://</w:t>
         </w:r>
+        <w:proofErr w:type="spellStart"/>
         <w:r>
           <w:rPr>
             <w:rStyle w:val="a6"/>
@@ -5798,6 +6504,7 @@
           </w:rPr>
           <w:t>vuejs</w:t>
         </w:r>
+        <w:proofErr w:type="spellEnd"/>
         <w:r>
           <w:rPr>
             <w:rStyle w:val="a6"/>
@@ -5943,7 +6650,6 @@
         <w:spacing w:line="276" w:lineRule="auto"/>
         <w:rPr>
           <w:sz w:val="28"/>
-          <w:lang w:val="en-US"/>
         </w:rPr>
         <w:sectPr>
           <w:pgSz w:w="11910" w:h="16840"/>
@@ -5955,7 +6661,6 @@
       <w:r>
         <w:rPr>
           <w:sz w:val="28"/>
-          <w:lang w:val="en-US"/>
         </w:rPr>
         <w:t>20</w:t>
       </w:r>

</xml_diff>